<commit_message>
Version submitted to Functional Ecology.
</commit_message>
<xml_diff>
--- a/submission/functional_ecology/kelly_title_page_func-ec.docx
+++ b/submission/functional_ecology/kelly_title_page_func-ec.docx
@@ -14,6 +14,7 @@
         </w:rPr>
       </w:pPr>
       <w:bookmarkStart w:id="0" w:name="data-availability"/>
+      <w:bookmarkStart w:id="1" w:name="OLE_LINK1"/>
       <w:r>
         <w:rPr>
           <w:rFonts w:ascii="Times New Roman" w:hAnsi="Times New Roman" w:cs="Times New Roman"/>
@@ -25,6 +26,7 @@
         <w:t>Residual correlation shows that European earwigs do not trade off clutch and egg size.</w:t>
       </w:r>
     </w:p>
+    <w:bookmarkEnd w:id="1"/>
     <w:p>
       <w:pPr>
         <w:pStyle w:val="Author"/>
@@ -197,7 +199,7 @@
           <w:szCs w:val="24"/>
         </w:rPr>
       </w:pPr>
-      <w:bookmarkStart w:id="1" w:name="author-contributions"/>
+      <w:bookmarkStart w:id="2" w:name="author-contributions"/>
       <w:bookmarkEnd w:id="0"/>
       <w:r>
         <w:rPr>
@@ -245,8 +247,8 @@
           <w:szCs w:val="24"/>
         </w:rPr>
       </w:pPr>
-      <w:bookmarkStart w:id="2" w:name="funding"/>
-      <w:bookmarkEnd w:id="1"/>
+      <w:bookmarkStart w:id="3" w:name="funding"/>
+      <w:bookmarkEnd w:id="2"/>
       <w:r>
         <w:rPr>
           <w:rFonts w:ascii="Times New Roman" w:hAnsi="Times New Roman" w:cs="Times New Roman"/>
@@ -279,8 +281,8 @@
           <w:szCs w:val="24"/>
         </w:rPr>
       </w:pPr>
-      <w:bookmarkStart w:id="3" w:name="conflict-of-interest"/>
-      <w:bookmarkEnd w:id="2"/>
+      <w:bookmarkStart w:id="4" w:name="conflict-of-interest"/>
+      <w:bookmarkEnd w:id="3"/>
       <w:r>
         <w:rPr>
           <w:rFonts w:ascii="Times New Roman" w:hAnsi="Times New Roman" w:cs="Times New Roman"/>
@@ -304,7 +306,7 @@
         <w:t>I declare no conflict of interest.</w:t>
       </w:r>
     </w:p>
-    <w:bookmarkEnd w:id="3"/>
+    <w:bookmarkEnd w:id="4"/>
     <w:p>
       <w:pPr>
         <w:pStyle w:val="Heading1"/>

</xml_diff>